<commit_message>
Reformat Part section headers to 'Part N.' and set to 12pt bold (Ver_2)
Change major section headers from 'Part N - Title' to 'Part N. Title' and
reduce their size from 13pt to 12pt (bold retained); Transaction Summary
header aligned to the same 12pt tier.
</commit_message>
<xml_diff>
--- a/NBU_Credit_Limit_Report_Jun_26_Ver_2.docx
+++ b/NBU_Credit_Limit_Report_Jun_26_Ver_2.docx
@@ -26,8 +26,8 @@
           <w:b/>
           <w:bCs/>
           <w:color w:val="1A3A5C"/>
-          <w:sz w:val="26"/>
-          <w:szCs w:val="26"/>
+          <w:sz w:val="24"/>
+          <w:szCs w:val="24"/>
         </w:rPr>
         <w:t>Transaction Summary</w:t>
       </w:r>
@@ -1847,10 +1847,10 @@
           <w:b/>
           <w:bCs/>
           <w:color w:val="1A3A5C"/>
-          <w:sz w:val="26"/>
-          <w:szCs w:val="26"/>
+          <w:sz w:val="24"/>
+          <w:szCs w:val="24"/>
         </w:rPr>
-        <w:t>Part 1 - Overall Evaluation of Customer</w:t>
+        <w:t>Part 1. Overall Evaluation of Customer</w:t>
       </w:r>
     </w:p>
     <w:p>
@@ -4219,11 +4219,11 @@
           <w:b/>
           <w:bCs/>
           <w:color w:val="1A3A5C"/>
-          <w:sz w:val="26"/>
-          <w:szCs w:val="26"/>
+          <w:sz w:val="24"/>
+          <w:szCs w:val="24"/>
         </w:rPr>
         <w:lastRenderedPageBreak/>
-        <w:t>Part 2 - Evaluation and Financial Position</w:t>
+        <w:t>Part 2. Evaluation and Financial Position</w:t>
       </w:r>
     </w:p>
     <w:p>
@@ -15176,11 +15176,11 @@
           <w:b/>
           <w:bCs/>
           <w:color w:val="1A3A5C"/>
-          <w:sz w:val="26"/>
-          <w:szCs w:val="26"/>
+          <w:sz w:val="24"/>
+          <w:szCs w:val="24"/>
         </w:rPr>
         <w:lastRenderedPageBreak/>
-        <w:t>Part 3 - Risk Analysis</w:t>
+        <w:t>Part 3. Risk Analysis</w:t>
       </w:r>
     </w:p>
     <w:p>
@@ -15526,11 +15526,11 @@
           <w:b/>
           <w:bCs/>
           <w:color w:val="1A3A5C"/>
-          <w:sz w:val="26"/>
-          <w:szCs w:val="26"/>
+          <w:sz w:val="24"/>
+          <w:szCs w:val="24"/>
         </w:rPr>
         <w:lastRenderedPageBreak/>
-        <w:t>Part 4 - Historical Banking Relationship and Plan</w:t>
+        <w:t>Part 4. Historical Banking Relationship and Plan</w:t>
       </w:r>
     </w:p>
     <w:p>
@@ -15627,11 +15627,11 @@
           <w:b/>
           <w:bCs/>
           <w:color w:val="1A3A5C"/>
-          <w:sz w:val="26"/>
-          <w:szCs w:val="26"/>
+          <w:sz w:val="24"/>
+          <w:szCs w:val="24"/>
         </w:rPr>
         <w:lastRenderedPageBreak/>
-        <w:t>Part 5 - Internal and External Rating of NBU</w:t>
+        <w:t>Part 5. Internal and External Rating of NBU</w:t>
       </w:r>
     </w:p>
     <w:p>
@@ -17089,10 +17089,10 @@
           <w:b/>
           <w:bCs/>
           <w:color w:val="1A3A5C"/>
-          <w:sz w:val="26"/>
-          <w:szCs w:val="26"/>
+          <w:sz w:val="24"/>
+          <w:szCs w:val="24"/>
         </w:rPr>
-        <w:t>Part 6 - Evaluation of Credit Risk and Calculation of Reference Value of Credit Line</w:t>
+        <w:t>Part 6. Evaluation of Credit Risk and Calculation of Reference Value of Credit Line</w:t>
       </w:r>
     </w:p>
     <w:p>
@@ -17841,10 +17841,10 @@
           <w:b/>
           <w:bCs/>
           <w:color w:val="1A3A5C"/>
-          <w:sz w:val="26"/>
-          <w:szCs w:val="26"/>
+          <w:sz w:val="24"/>
+          <w:szCs w:val="24"/>
         </w:rPr>
-        <w:t>Part 7 - Proposed Key Transaction Terms, Financial Covenants and Risk Mitigants</w:t>
+        <w:t>Part 7. Proposed Key Transaction Terms, Financial Covenants and Risk Mitigants</w:t>
       </w:r>
     </w:p>
     <w:p>
@@ -19481,10 +19481,10 @@
           <w:b/>
           <w:bCs/>
           <w:color w:val="1A3A5C"/>
-          <w:sz w:val="26"/>
-          <w:szCs w:val="26"/>
+          <w:sz w:val="24"/>
+          <w:szCs w:val="24"/>
         </w:rPr>
-        <w:t>Part 8 - Transaction Details</w:t>
+        <w:t>Part 8. Transaction Details</w:t>
       </w:r>
     </w:p>
     <w:p>

</xml_diff>

<commit_message>
Address RM feedback: FID loan request, Loan Risk Agreement, NPL basis (Ver_2)
- Transaction Summary: state FID's request explicitly as an application to
  undertake the loan business; specify ICBC (Asia) signs a Loan Risk
  Agreement with ICBC (DIFC Branch) and that ICBC (DIFC Branch) acts as
  lead/Face Lender branch for the CNH 500m internal syndication
- Section 2.5: present Uzbek-bank NPL on a consistent CBU regulatory basis
  (NBU ~2.9%, SQB ~3.7%, sector ~3.8%) and cite the CBU monthly NPL
  statistics (June 2025); footnote explains the basis vs IFRS Stage 3
</commit_message>
<xml_diff>
--- a/NBU_Credit_Limit_Report_Jun_26_Ver_2.docx
+++ b/NBU_Credit_Limit_Report_Jun_26_Ver_2.docx
@@ -500,7 +500,7 @@
         <w:rPr>
           <w:color w:val="1A1A1A"/>
         </w:rPr>
-        <w:t>NBU has mandated Mashreqbank psc ("Mashreq") and Bank of China (Dubai) Branch ("BOC Dubai"), together the Initial Mandated Lead Arrangers and Bookrunners (the "IMLABs"), to arrange and coordinate the syndication of a CNH-denominated senior unsecured term loan facility of up to CNH 2.0 billion (the "Facility"), launching at CNH 1.0 billion with a green-shoe option. The Facility has a three-year tenor, carries a fixed interest rate of 3.8% per annum and a 0.6% flat upfront fee, and is being documented on LMA terms. FID proposes that ICBC (DIFC Branch) participate in the Facility as a lender. ICBC Almaty Branch is the client management branch for NBU</w:t>
+        <w:t>NBU has mandated Mashreqbank psc ("Mashreq") and Bank of China (Dubai) Branch ("BOC Dubai"), together the Initial Mandated Lead Arrangers and Bookrunners (the "IMLABs"), to arrange and coordinate the syndication of a CNH-denominated senior unsecured term loan facility of up to CNH 2.0 billion (the "Facility"), launching at CNH 1.0 billion with a green-shoe option. The Facility has a three-year tenor, carries a fixed interest rate of 3.8% per annum and a 0.6% flat upfront fee, and is being documented on LMA terms. FID hereby applies for approval to undertake the loan business under the Facility, with ICBC (DIFC Branch) participating as a lender. ICBC Almaty Branch is the client management branch for NBU</w:t>
       </w:r>
       <w:r>
         <w:rPr>
@@ -513,33 +513,7 @@
         <w:rPr>
           <w:color w:val="1A1A1A"/>
         </w:rPr>
-        <w:t xml:space="preserve">; however, under Kazakhstan law ICBC Almaty Branch may sign the commitment letter only on its own behalf and cannot extend its commitment to other ICBC branches; ICBC Almaty Branch's internal rating and credit limit approval for NBU also remain internally in progress (see Section 1.4). Accordingly, and given the larger commitment amount in this syndicated loan, ICBC (DIFC Branch) will act as the Face Lender as between ICBC (DIFC Branch) and ICBC (Asia), with ICBC (DIFC Branch) applying for a CNH 300 million commitment and the remaining CNH 100 million committed by ICBC (Asia). Bank of China (Dubai) Branch, as coordinator, is expected to commit CNH 500 million (understood to have been approved within Bank of China (Dubai)); the ICBC Group, with an aggregate commitment of CNH </w:t>
-      </w:r>
-      <w:r>
-        <w:rPr>
-          <w:rFonts w:hint="eastAsia"/>
-          <w:color w:val="1A1A1A"/>
-        </w:rPr>
-        <w:t>5</w:t>
-      </w:r>
-      <w:r>
-        <w:rPr>
-          <w:color w:val="1A1A1A"/>
-        </w:rPr>
-        <w:t>00 million</w:t>
-      </w:r>
-      <w:r>
-        <w:rPr>
-          <w:rFonts w:hint="eastAsia"/>
-          <w:color w:val="1A1A1A"/>
-        </w:rPr>
-        <w:t xml:space="preserve"> CNH</w:t>
-      </w:r>
-      <w:r>
-        <w:rPr>
-          <w:color w:val="1A1A1A"/>
-        </w:rPr>
-        <w:t>, will therefore not be the largest lender in the syndicate. To our knowledge, no other Chinese bank will participate in the syndication.</w:t>
+        <w:t xml:space="preserve">; however, under Kazakhstan law ICBC Almaty Branch may sign the commitment letter only on its own behalf and cannot extend its commitment to other ICBC branches; ICBC Almaty Branch's internal rating and credit limit approval for NBU also remain internally in progress (see Section 1.4). Accordingly, and given the larger commitment amount in this syndicated loan, ICBC (DIFC Branch) will act as the Face Lender as between ICBC (DIFC Branch) and ICBC (Asia), with ICBC (DIFC Branch) applying for a CNH 300 million commitment and the remaining CNH 100 million committed by ICBC (Asia), which will sign a Loan Risk Agreement with ICBC (DIFC Branch) in respect of its CNH 100 million share. The ICBC Group's internal syndication therefore totals CNH 500 million — ICBC Almaty Branch CNH 100 million (signing on its own behalf), and ICBC (DIFC Branch) CNH 300 million and ICBC (Asia) CNH 100 million fronted by ICBC (DIFC Branch), which acts as the lead / Face Lender branch for the internal syndication. Bank of China (Dubai) Branch, as coordinator, is expected to commit CNH 500 million (understood to have been approved within Bank of China (Dubai)); accordingly, no single ICBC lender will be the largest lender in the syndicate. To our knowledge, no other Chinese bank will participate in the syndication.</w:t>
       </w:r>
     </w:p>
     <w:p>
@@ -12226,7 +12200,7 @@
                 <w:sz w:val="18"/>
                 <w:szCs w:val="18"/>
               </w:rPr>
-              <w:t>NPL ratio (Stage 3 / gross loans)</w:t>
+              <w:t>NPL ratio (regulatory / Stage 3)</w:t>
             </w:r>
           </w:p>
         </w:tc>
@@ -12255,7 +12229,7 @@
                 <w:sz w:val="18"/>
                 <w:szCs w:val="18"/>
               </w:rPr>
-              <w:t>4.2%¹</w:t>
+              <w:t>~2.9%¹</w:t>
             </w:r>
           </w:p>
         </w:tc>
@@ -12282,7 +12256,7 @@
                 <w:sz w:val="18"/>
                 <w:szCs w:val="18"/>
               </w:rPr>
-              <w:t>2.8%</w:t>
+              <w:t>~3.7%</w:t>
             </w:r>
           </w:p>
         </w:tc>
@@ -15143,7 +15117,7 @@
           <w:sz w:val="16"/>
           <w:szCs w:val="16"/>
         </w:rPr>
-        <w:t>All five banks are shown on a 2025 1H basis as at 30 June 2025; monetary KPIs in USD million, ratios in per cent. Only ROE and ROA are annualised (six-month result × 2); net profit and net interest income are six-month (1H 2025) figures and NIM is each bank’s published period margin. FX uniform at USD/UZS = 12,150 and USD/KZT = 519.73 (period-end, 30 June 2025). ¹ NBU NPL is shown on the IFRS Stage 3 / gross-loans basis (4.2%); NBU’s regulatory NPL reported to the CBU is 2.8%, and the 5.6% figure cited elsewhere is the provision-to-gross-loans coverage ratio (not an NPL ratio). ² Agrobank reported-period net interest income is not reliably disclosed and is marked n.a. ³ Kaspi.kz reports as a diversified payments/marketplace/fintech group and does not disclose NIM, cost-to-income, ROE, ROA, regulatory capital or NPL coverage on a comparable banking basis (marked n.a.); its 1H 2025 net profit of about USD 987 million (KZT 513 billion) is the consolidated figure including the Hepsiburada/Türkiye operations. Figures marked “~” for Halyk and Kaspi (net interest income, ROA, capital, LDR, and the balance-sheet scale lines) are FID estimates derived from each bank’s 1H 2025 results releases, disclosed growth rates and period-end positions, pending the full interim IFRS statements; SQB and Agrobank figures, and the NBU LCR/NSFR marked *, are FID estimates as in Section 2.4. Sources: Halyk Bank 1H 2025 results (19 August 2025) and Kaspi.kz 2Q &amp; 1H 2025 results (4 August 2025); Central Bank of Uzbekistan; and Moody’s, Fitch and S&amp;P rating publications. Halyk: Moody’s Baa1, Fitch BBB-, S&amp;P BBB- (all Stable). Kaspi.kz: Moody’s Baa3, Fitch BBB- (Stable); not rated by S&amp;P.</w:t>
+        <w:t>All five banks are shown on a 2025 1H basis as at 30 June 2025; monetary KPIs in USD million, ratios in per cent. Only ROE and ROA are annualised (six-month result × 2); net profit and net interest income are six-month (1H 2025) figures and NIM is each bank’s published period margin. FX uniform at USD/UZS = 12,150 and USD/KZT = 519.73 (period-end, 30 June 2025). ¹ NPL ratios for the Uzbek banks are shown on the Central Bank of Uzbekistan (CBU) regulatory basis from the CBU’s monthly NPL statistics for June 2025 — NBU approximately 2.9% and SQB approximately 3.7%, against a banking-sector average of approximately 3.8% — on which consistent basis NBU’s asset quality compares favourably with SQB and the sector. Agrobank (approximately 5.8%) and the Kazakh banks (Halyk 6.6%, Kaspi 5.7%) are shown on the IFRS Stage 3 / non-performing basis per their own disclosures, as the CBU does not separately publish their regulatory NPL. NBU’s IFRS Stage 3 ratio was 4.2% at 30 June 2025; the difference from the 2.9% regulatory figure reflects the more conservative IFRS staging definition, and the 5.6% figure cited elsewhere is NBU’s provision-to-gross-loans coverage ratio (not an NPL ratio). ² Agrobank reported-period net interest income is not reliably disclosed and is marked n.a. ³ Kaspi.kz reports as a diversified payments/marketplace/fintech group and does not disclose NIM, cost-to-income, ROE, ROA, regulatory capital or NPL coverage on a comparable banking basis (marked n.a.); its 1H 2025 net profit of about USD 987 million (KZT 513 billion) is the consolidated figure including the Hepsiburada/Türkiye operations. Figures marked “~” for Halyk and Kaspi (net interest income, ROA, capital, LDR, and the balance-sheet scale lines) are FID estimates derived from each bank’s 1H 2025 results releases, disclosed growth rates and period-end positions, pending the full interim IFRS statements; SQB and Agrobank figures, and the NBU LCR/NSFR marked *, are FID estimates as in Section 2.4. Sources: Halyk Bank 1H 2025 results (19 August 2025) and Kaspi.kz 2Q &amp; 1H 2025 results (4 August 2025); Central Bank of Uzbekistan (monthly NPL statistics, June 2025); and Moody’s, Fitch and S&amp;P rating publications. Halyk: Moody’s Baa1, Fitch BBB-, S&amp;P BBB- (all Stable). Kaspi.kz: Moody’s Baa3, Fitch BBB- (Stable); not rated by S&amp;P.</w:t>
       </w:r>
     </w:p>
     <w:p>

</xml_diff>

<commit_message>
Fill FY2023/FY2024 capital and NPL KPI cells with sourced FID estimates
Replace the eight n.a. cells (Total CAR, Tier 1, regulatory NPL, IFRS
Stage 3 for FY2023/FY2024) with flagged FID estimates anchored to NBU's
Fitch Core Capital ratios, Fitch NBU NPL, sector CAR/Tier 1 aggregates and
capital-to-assets ratios; rewrite the KPI footnote with the basis and
sources (Fitch, CBU FSR, IMF FSAP). CBU does not separately publish NBU's
historical bank-level CAR/Tier 1, so these are estimates to be confirmed
against the audited FY2023/FY2024 IFRS statements.
</commit_message>
<xml_diff>
--- a/NBU_Credit_Limit_Report_Jun_26_Ver_2.docx
+++ b/NBU_Credit_Limit_Report_Jun_26_Ver_2.docx
@@ -10039,7 +10039,7 @@
                 <w:sz w:val="18"/>
                 <w:szCs w:val="18"/>
               </w:rPr>
-              <w:t>n.a.</w:t>
+              <w:t>~18.0%</w:t>
             </w:r>
           </w:p>
         </w:tc>
@@ -10066,7 +10066,7 @@
                 <w:sz w:val="18"/>
                 <w:szCs w:val="18"/>
               </w:rPr>
-              <w:t>n.a.</w:t>
+              <w:t>~17.5%</w:t>
             </w:r>
           </w:p>
         </w:tc>
@@ -10150,7 +10150,7 @@
                 <w:sz w:val="18"/>
                 <w:szCs w:val="18"/>
               </w:rPr>
-              <w:t>n.a.</w:t>
+              <w:t>~16.5%</w:t>
             </w:r>
           </w:p>
         </w:tc>
@@ -10177,7 +10177,7 @@
                 <w:sz w:val="18"/>
                 <w:szCs w:val="18"/>
               </w:rPr>
-              <w:t>n.a.</w:t>
+              <w:t>~16.0%</w:t>
             </w:r>
           </w:p>
         </w:tc>
@@ -10261,7 +10261,7 @@
                 <w:sz w:val="18"/>
                 <w:szCs w:val="18"/>
               </w:rPr>
-              <w:t>n.a.</w:t>
+              <w:t>~3.8%</w:t>
             </w:r>
           </w:p>
         </w:tc>
@@ -10288,7 +10288,7 @@
                 <w:sz w:val="18"/>
                 <w:szCs w:val="18"/>
               </w:rPr>
-              <w:t>n.a.</w:t>
+              <w:t>~4.0%</w:t>
             </w:r>
           </w:p>
         </w:tc>
@@ -10372,7 +10372,7 @@
                 <w:sz w:val="18"/>
                 <w:szCs w:val="18"/>
               </w:rPr>
-              <w:t>n.a.</w:t>
+              <w:t>~4.4%</w:t>
             </w:r>
           </w:p>
         </w:tc>
@@ -10399,7 +10399,7 @@
                 <w:sz w:val="18"/>
                 <w:szCs w:val="18"/>
               </w:rPr>
-              <w:t>n.a.</w:t>
+              <w:t>~4.3%</w:t>
             </w:r>
           </w:p>
         </w:tc>
@@ -10810,7 +10810,7 @@
           <w:sz w:val="16"/>
           <w:szCs w:val="16"/>
         </w:rPr>
-        <w:t>2023 and 2024 are full-year statutory figures; 2025 1H reflects the six-month interim IFRS results as at 30 June 2025. Net profit, net profit (USD) and net interest income for 2025 1H are six-month figures and are not annualised. † 2025 1H ROE is shown on an FY2025 statutory basis, as the six-month interim profit is not annualised, so a like-for-like half-year ROE is not directly comparable. n.a. = not separately available for the period. CAR, Tier 1 and NPL are NBU-specific (FID estimates / CBU and IFRS bases; see the detailed table below). Data source: Central Bank of Uzbekistan (1 January 2026 publication) and 2025 1H financial statements.</w:t>
+        <w:t>2023 and 2024 are full-year statutory figures; 2025 1H reflects the six-month interim IFRS results as at 30 June 2025. Net profit, net profit (USD) and net interest income for 2025 1H are six-month figures and are not annualised. † 2025 1H ROE is shown on an FY2025 statutory basis, as the six-month interim profit is not annualised, so a like-for-like half-year ROE is not directly comparable. The capital-adequacy and asset-quality ratios (Total CAR, Tier 1, regulatory NPL and IFRS Stage 3) are NBU-specific FID estimates. The 2025 1H figures are derived from NBU’s prudential returns and its reviewed 1H 2025 IFRS financial statements; the FY2023 and FY2024 figures (each marked “~”) are FID estimates, because the CBU does not separately publish NBU’s bank-level regulatory CAR and Tier 1 ratios for prior years. They are anchored to NBU’s capital-to-assets ratio (~14.0% in 2023-2024 and 14.5% at 1H 2025), NBU’s Fitch Core Capital ratio (~23% at end-2022, above 20% through 2023-2024 and ~19% at mid-2025) and Fitch’s NBU Tier 1 of ~17.8% at mid-2025, the Uzbekistan banking-sector aggregates (sector CAR ~17.9% in 2023 and ~17.1% in 2024; sector Tier 1 ~14.2%), and NBU’s regulatory NPL of ~4% at end-2024 with IFRS Stage 3 ~4.4% at mid-2023, improving to 2.8% regulatory / 4.2% Stage 3 at 1H 2025. n.a. denotes not separately available for the period. Data sources: Fitch Ratings reports on NBU (April 2024 and March 2026); Central Bank of Uzbekistan (Financial Stability Reports and 1 January 2026 publication); IMF Uzbekistan Financial Sector Assessment (2025); and NBU’s 2025 1H IFRS financial statements. The prior-year ratios should be confirmed against NBU’s audited FY2023 and FY2024 IFRS statements.</w:t>
       </w:r>
     </w:p>
     <w:p>

</xml_diff>

<commit_message>
Rebase Section 2.2 onto 1H2025 reviewed IFRS data with annualised income
- Recast Section 2.2 (retitled 'Financial Performance in 1H 2025') on the
  same reviewed IFRS interim basis as Section 2.1, with balance-sheet
  movements over the half-year vs 31 Dec 2024 and income vs 1H 2024
- Annualise net income and return measures (x2); ties ROA ~1.1% (6m) to
  Section 2.4 and annualised ROA ~2.3% / ROE ~15.7% to Section 2.5
- Add the source line (NBU interim IFRS FS reviewed by Deloitte & Touche),
  resolving the missing FY2025 statutory source
</commit_message>
<xml_diff>
--- a/NBU_Credit_Limit_Report_Jun_26_Ver_2.docx
+++ b/NBU_Credit_Limit_Report_Jun_26_Ver_2.docx
@@ -8217,7 +8217,7 @@
           <w:sz w:val="22"/>
           <w:szCs w:val="22"/>
         </w:rPr>
-        <w:t>2.2 Financial Performance in 2025</w:t>
+        <w:t>2.2 Financial Performance in 1H 2025</w:t>
       </w:r>
     </w:p>
     <w:p>
@@ -8228,7 +8228,7 @@
         <w:rPr>
           <w:color w:val="1A1A1A"/>
         </w:rPr>
-        <w:t>The discussion below analyses NBU’s FY2025 financial performance and position, organised into three parts — Asset Analysis, Liability Analysis and Income Analysis. Year-on-year movements are stated on a statutory full-year basis — the Bank’s CBU/national-accounting results for the year ended 31 December 2025 — unless otherwise indicated. These statutory FY2025 figures are used here because the FY2025 IFRS audit was still pending at the report date; they are therefore on a different period and basis from the reviewed IFRS interim figures in Section 2.1 and the 2025 1H column in Section 2.4 (the six months ended 30 June 2025). Certain captions consequently differ between the two presentations — for example, total assets of UZS 144.7 trillion (statutory, 31 December 2025) versus UZS 145.4 trillion (IFRS, 30 June 2025), total equity of UZS 19,968.5 billion (statutory, FY2025) versus UZS 21,097.5 billion (IFRS, 30 June 2025), and full-year net profit of UZS 1,919.0 billion (statutory, FY2025) versus the six-month figure of UZS 1,653.1 billion (IFRS) shown in Sections 2.1 and 2.4 — reflecting the difference in period (full-year versus six-month) and in measurement basis (statutory versus IFRS) rather than a discrepancy in the underlying results.</w:t>
+        <w:t xml:space="preserve">The discussion below analyses NBU’s financial performance and position for the first half of 2025, organised into three parts — Asset Analysis, Liability Analysis and Income Analysis — on the same reviewed IFRS interim basis as Section 2.1 (the six months ended 30 June 2025, reviewed by Deloitte &amp; Touche). Balance-sheet movements are measured over the half-year against 31 December 2024, and income-statement movements against the six months ended 30 June 2024; net-income and return measures are also shown on an annualised basis (six-month result × 2) where indicated, to give a full-year-equivalent view. These figures reconcile to Section 2.1 and will be superseded by NBU’s audited FY2025 IFRS financial statements when published. Source: NBU interim condensed consolidated financial statements for the six months ended 30 June 2025 (reviewed by Deloitte &amp; Touche).</w:t>
       </w:r>
     </w:p>
     <w:p>
@@ -8246,73 +8246,13 @@
     </w:p>
     <w:p>
       <w:pPr>
-        <w:pStyle w:val="ListParagraph"/>
-        <w:numPr>
-          <w:ilvl w:val="0"/>
-          <w:numId w:val="2"/>
-        </w:numPr>
-        <w:spacing w:before="40" w:after="40"/>
+        <w:spacing w:before="60" w:after="80"/>
       </w:pPr>
       <w:r>
         <w:rPr>
           <w:color w:val="1A1A1A"/>
         </w:rPr>
-        <w:t>Total assets grew 7.1% year-on-year to UZS 144.7 trillion (~USD 11.9 billion), consolidating NBU's position as Uzbekistan's largest bank with approximately 16% system market share.</w:t>
-      </w:r>
-    </w:p>
-    <w:p>
-      <w:pPr>
-        <w:pStyle w:val="ListParagraph"/>
-        <w:numPr>
-          <w:ilvl w:val="0"/>
-          <w:numId w:val="2"/>
-        </w:numPr>
-        <w:spacing w:before="40" w:after="40"/>
-      </w:pPr>
-      <w:r>
-        <w:rPr>
-          <w:color w:val="1A1A1A"/>
-        </w:rPr>
-        <w:t xml:space="preserve">Loans and leasing, net, remained broadly stable at UZS 99,444.3 billion (-1.1% YoY), compared to UZS 100,534.0 billion in 2024, reflecting a more cautious approach to credit extension amid elevated provisioning levels. The gross loan book stood at UZS 105,382.2 billion with a provision coverage ratio (total loan-loss provisions to gross loans) of approximately 5.6%. This provision coverage ratio is distinct </w:t>
-      </w:r>
-      <w:r>
-        <w:rPr>
-          <w:color w:val="1A1A1A"/>
-        </w:rPr>
-        <w:lastRenderedPageBreak/>
-        <w:t>from, and should not be read as, the non-performing loan (NPL) ratio: NBU’s regulatory NPL ratio reported to the Central Bank of Uzbekistan (CBU) was approximately 2.8% as of 1 January 2026 (see Section 2.4).</w:t>
-      </w:r>
-    </w:p>
-    <w:p>
-      <w:pPr>
-        <w:pStyle w:val="ListParagraph"/>
-        <w:numPr>
-          <w:ilvl w:val="0"/>
-          <w:numId w:val="2"/>
-        </w:numPr>
-        <w:spacing w:before="40" w:after="40"/>
-      </w:pPr>
-      <w:r>
-        <w:rPr>
-          <w:color w:val="1A1A1A"/>
-        </w:rPr>
-        <w:t>Interbank placements grew significantly to UZS 20,455.4 billion (+75.9% YoY), reflecting deployment of liquidity into higher-yielding interbank assets, consistent with the bank's active treasury management.</w:t>
-      </w:r>
-    </w:p>
-    <w:p>
-      <w:pPr>
-        <w:pStyle w:val="ListParagraph"/>
-        <w:numPr>
-          <w:ilvl w:val="0"/>
-          <w:numId w:val="2"/>
-        </w:numPr>
-        <w:spacing w:before="40" w:after="40"/>
-      </w:pPr>
-      <w:r>
-        <w:rPr>
-          <w:color w:val="1A1A1A"/>
-        </w:rPr>
-        <w:t>Securities portfolio expanded 18.8% to UZS 8,633.7 billion, supported by continued investment in domestic government bonds and notes.</w:t>
+        <w:t xml:space="preserve">Total assets grew 6.3% over the half-year to UZS 145.4 trillion (~USD 11.9 billion) at 30 June 2025, from UZS 136.8 trillion at 31 December 2024, consolidating NBU’s position as Uzbekistan’s largest bank with approximately 16% system market share. The growth was driven primarily by a build-up of liquid assets alongside continued, more measured, loan growth.</w:t>
       </w:r>
     </w:p>
     <w:p>
@@ -8323,7 +8263,40 @@
         <w:rPr>
           <w:color w:val="1A1A1A"/>
         </w:rPr>
-        <w:t>On asset quality, NBU’s regulatory NPL ratio of approximately 2.8% (CBU, NBU-specific, as of 1 January 2026) sits below the banking-sector average of 4.1% (December 2025), consistent with the Bank’s position as the state-owned flagship institution. The figure of approximately 5.6% cited elsewhere is the loan-loss provision coverage ratio (total provisions to gross loans) on a statutory basis and is not an NPL ratio. On an IFRS basis, Stage 3 (credit-impaired) loans were approximately 4.2% of gross loans at 30 June 2025; the IMF has noted that IFRS Stage 3 ratios in Uzbekistan typically run at roughly twice the regulatory NPL ratio, which is broadly consistent with the 2.8% regulatory figure. NBU’s capitalisation is solid: total equity was UZS 21,097.5 billion on an IFRS basis at 30 June 2025 (UZS 19,968.5 billion statutory at FY2025), equivalent to a capital-to-assets ratio of approximately 14.5%, and Fitch has estimated the Bank’s Fitch Core Capital ratio above 20% for 2024-2025. NBU’s exact bank-level regulatory CAR, Tier 1 ratio and liquidity coverage ratio as of 1 January 2026 should be confirmed from the CBU bank-level prudential returns and are marked accordingly in Section 2.4.</w:t>
+        <w:t xml:space="preserve">Loans to customers (net) rose 1.7% over the half-year to UZS 104.3 trillion at 30 June 2025, from UZS 102.6 trillion at 31 December 2024, reflecting a more measured pace of credit extension amid elevated provisioning levels; net loans remained the Bank’s largest asset class at roughly two-thirds of interest-earning assets.</w:t>
+      </w:r>
+    </w:p>
+    <w:p>
+      <w:pPr>
+        <w:spacing w:before="60" w:after="80"/>
+      </w:pPr>
+      <w:r>
+        <w:rPr>
+          <w:color w:val="1A1A1A"/>
+        </w:rPr>
+        <w:t xml:space="preserve">Liquidity was built up materially over the half-year: cash and cash equivalents increased 51.1% to UZS 27.8 trillion (from UZS 18.4 trillion at 31 December 2024) and amounts due from credit institutions rose 3.4% to UZS 3.7 trillion, reflecting deployment into higher-yielding short-term and interbank assets consistent with the Bank’s active treasury management.</w:t>
+      </w:r>
+    </w:p>
+    <w:p>
+      <w:pPr>
+        <w:spacing w:before="60" w:after="80"/>
+      </w:pPr>
+      <w:r>
+        <w:rPr>
+          <w:color w:val="1A1A1A"/>
+        </w:rPr>
+        <w:t xml:space="preserve">The investment-securities portfolio was reduced by 48.2% over the half-year to UZS 3.9 trillion (from UZS 7.4 trillion at 31 December 2024), as maturing government bonds and notes were redeployed into cash and interbank placements.</w:t>
+      </w:r>
+    </w:p>
+    <w:p>
+      <w:pPr>
+        <w:spacing w:before="60" w:after="80"/>
+      </w:pPr>
+      <w:r>
+        <w:rPr>
+          <w:color w:val="1A1A1A"/>
+        </w:rPr>
+        <w:t xml:space="preserve">On asset quality, NBU’s regulatory NPL ratio of approximately 2.8% (CBU, NBU-specific) sits below the banking-sector average of 4.1% (December 2025), consistent with the Bank’s position as the state-owned flagship institution. On an IFRS basis, Stage 3 (credit-impaired) loans were approximately 4.2% of gross loans at 30 June 2025, while the loan-loss provision coverage ratio (total provisions to gross loans) was approximately 5.6% on a statutory basis and is not an NPL ratio; the IMF has noted that IFRS Stage 3 ratios in Uzbekistan typically run at roughly twice the regulatory NPL ratio. NBU’s capitalisation is solid: total equity was UZS 21.1 trillion at 30 June 2025, equivalent to a capital-to-assets ratio of approximately 14.5%, and Fitch has estimated the Bank’s Fitch Core Capital ratio above 20% for 2024-2025. NBU’s estimated bank-level regulatory CAR (~18.2%) and Tier 1 ratio (~16.9%) at 30 June 2025 are set out in Section 2.4.</w:t>
       </w:r>
     </w:p>
     <w:p>
@@ -8341,50 +8314,35 @@
     </w:p>
     <w:p>
       <w:pPr>
-        <w:pStyle w:val="ListParagraph"/>
-        <w:numPr>
-          <w:ilvl w:val="0"/>
-          <w:numId w:val="2"/>
-        </w:numPr>
-        <w:spacing w:before="40" w:after="40"/>
+        <w:spacing w:before="60" w:after="80"/>
       </w:pPr>
       <w:r>
         <w:rPr>
           <w:color w:val="1A1A1A"/>
         </w:rPr>
-        <w:t>Total customer deposits increased 36.9% to UZS 50,447 billion (demand + time deposits), demonstrating robust franchise strength and continued deepening of retail and corporate funding base. Customer deposits rose from UZS 36,839 billion in 2024, a strategic deepening of the deposit franchise as a lower-cost funding alternative to foreign borrowings.</w:t>
+        <w:t xml:space="preserve">Total customer deposits (amounts due to customers) increased 22.5% over the half-year to UZS 47.3 trillion at 30 June 2025, from UZS 38.6 trillion at 31 December 2024, demonstrating robust franchise strength and a continued, strategic deepening of the retail and corporate funding base as a lower-cost alternative to foreign wholesale borrowings.</w:t>
       </w:r>
     </w:p>
     <w:p>
       <w:pPr>
-        <w:pStyle w:val="ListParagraph"/>
-        <w:numPr>
-          <w:ilvl w:val="0"/>
-          <w:numId w:val="2"/>
-        </w:numPr>
-        <w:spacing w:before="40" w:after="40"/>
+        <w:spacing w:before="60" w:after="80"/>
       </w:pPr>
       <w:r>
         <w:rPr>
           <w:color w:val="1A1A1A"/>
         </w:rPr>
-        <w:t>Borrowings from foreign lenders (payable loans) declined 15.3% to UZS 48,137.5 billion, as the bank actively diversified toward capital market instruments, with debt securities issued growing 10.6% to UZS 10,085.0 billion — bolstered by the 2025 dual-tranche Eurobond.</w:t>
+        <w:t xml:space="preserve">Conversely, wholesale funding was trimmed over the half-year: other borrowed funds (largely foreign-lender facilities) declined 5.6% to UZS 54.1 trillion and debt securities issued fell 5.6% to UZS 8.8 trillion, while amounts due to credit institutions rose 33.9% to UZS 11.0 trillion. The shift toward domestic deposits reduced reliance on foreign borrowings.</w:t>
       </w:r>
     </w:p>
     <w:p>
       <w:pPr>
-        <w:pStyle w:val="ListParagraph"/>
-        <w:numPr>
-          <w:ilvl w:val="0"/>
-          <w:numId w:val="2"/>
-        </w:numPr>
-        <w:spacing w:before="40" w:after="40"/>
+        <w:spacing w:before="60" w:after="80"/>
       </w:pPr>
       <w:r>
         <w:rPr>
           <w:color w:val="1A1A1A"/>
         </w:rPr>
-        <w:t>The bank maintained a strong capital base with total equity of UZS 19,968.5 billion, and authorized capital increased to UZS 17,767.1 billion reflecting government capital injections.</w:t>
+        <w:t xml:space="preserve">The Bank maintained a strong capital base, with total equity rising 5.2% over the half-year to UZS 21.1 trillion at 30 June 2025 (from UZS 20.0 trillion at 31 December 2024), supported by retained earnings; share capital stood at UZS 16.7 trillion, reflecting prior government capital injections.</w:t>
       </w:r>
     </w:p>
     <w:p>
@@ -8402,82 +8360,57 @@
     </w:p>
     <w:p>
       <w:pPr>
-        <w:pStyle w:val="ListParagraph"/>
-        <w:numPr>
-          <w:ilvl w:val="0"/>
-          <w:numId w:val="2"/>
-        </w:numPr>
-        <w:spacing w:before="40" w:after="40"/>
+        <w:spacing w:before="60" w:after="80"/>
       </w:pPr>
       <w:r>
         <w:rPr>
           <w:color w:val="1A1A1A"/>
         </w:rPr>
-        <w:t>Net profit rose 11.4% to UZS 1,919.0 billion (~USD 158 million), driven by strong growth in non-interest income (up 53.9% YoY) and higher net interest income, partially offset by increased operating and provisioning costs.</w:t>
+        <w:t xml:space="preserve">Net profit for the six months ended 30 June 2025 was UZS 1,653.1 billion (~USD 136 million), up 9.1% year on year from UZS 1,514.7 billion in the first half of 2024; on an annualised basis (six-month result × 2) this is equivalent to approximately UZS 3,306 billion (~USD 272 million), driven by higher net interest income and strong growth in fee and foreign-exchange income, partly offset by higher operating and provisioning costs.</w:t>
       </w:r>
     </w:p>
     <w:p>
       <w:pPr>
-        <w:pStyle w:val="ListParagraph"/>
-        <w:numPr>
-          <w:ilvl w:val="0"/>
-          <w:numId w:val="2"/>
-        </w:numPr>
-        <w:spacing w:before="40" w:after="40"/>
+        <w:spacing w:before="60" w:after="80"/>
       </w:pPr>
       <w:r>
         <w:rPr>
           <w:color w:val="1A1A1A"/>
         </w:rPr>
-        <w:t>Net interest income (before provisions) increased 7.6% to UZS 5,782.1 billion, supported by loan book repricing and higher interbank and securities income.</w:t>
+        <w:t xml:space="preserve">Net interest income increased 8.4% year on year to UZS 3,258.8 billion for the six months (annualised, approximately UZS 6,517.7 billion), as a 12.9% rise in interest income outpaced a 17.5% increase in interest expense from higher funding balances; the net interest margin was approximately 4.5%.</w:t>
       </w:r>
     </w:p>
     <w:p>
       <w:pPr>
-        <w:pStyle w:val="ListParagraph"/>
-        <w:numPr>
-          <w:ilvl w:val="0"/>
-          <w:numId w:val="2"/>
-        </w:numPr>
-        <w:spacing w:before="40" w:after="40"/>
+        <w:spacing w:before="60" w:after="80"/>
       </w:pPr>
       <w:r>
         <w:rPr>
           <w:color w:val="1A1A1A"/>
         </w:rPr>
-        <w:t>Non-interest income surged 53.9% to UZS 11,425.2 billion, reflecting a substantial recovery in loan loss reserve reversals (UZS 6,932.8 billion), FX income growth (+36.8%), fee and commission income growth (+31.9%), and strong investment dividend and income flows.</w:t>
+        <w:t xml:space="preserve">Non-interest income grew strongly: fee and commission income rose 24.7% year on year to UZS 559.3 billion and net foreign-exchange gains increased 46.3% to UZS 888.3 billion in the first half of 2025, reflecting higher transaction volumes and trade-related activity.</w:t>
       </w:r>
     </w:p>
     <w:p>
       <w:pPr>
-        <w:pStyle w:val="ListParagraph"/>
-        <w:numPr>
-          <w:ilvl w:val="0"/>
-          <w:numId w:val="2"/>
-        </w:numPr>
-        <w:spacing w:before="40" w:after="40"/>
+        <w:spacing w:before="60" w:after="80"/>
       </w:pPr>
       <w:r>
         <w:rPr>
           <w:color w:val="1A1A1A"/>
         </w:rPr>
-        <w:t>Operating expenses rose 22.1% to UZS 2,756.4 billion, driven by higher staff costs (+18.8%), IT and infrastructure investment, rent and premises costs.</w:t>
+        <w:t xml:space="preserve">Personnel and other operating expenses rose 15.7% year on year to UZS 1,362.8 billion, driven by higher staff costs and continued IT and infrastructure investment; the cost-to-income ratio nonetheless remained low at approximately 29%. The credit-loss expense increased 11.3% to UZS 668.0 billion and profit before tax rose 11.9% to UZS 2,163.7 billion.</w:t>
       </w:r>
     </w:p>
     <w:p>
       <w:pPr>
-        <w:pStyle w:val="ListParagraph"/>
-        <w:numPr>
-          <w:ilvl w:val="0"/>
-          <w:numId w:val="2"/>
-        </w:numPr>
-        <w:spacing w:before="40" w:after="40"/>
+        <w:spacing w:before="60" w:after="80"/>
       </w:pPr>
       <w:r>
         <w:rPr>
           <w:color w:val="1A1A1A"/>
         </w:rPr>
-        <w:t>Profitability is steady, with a statutory return on assets of approximately 1.3% and return on equity of approximately 9.6% for FY2025; the lower ROA relative to the 2.2% sector average reflects NBU’s large, lower-margin state-directed project-lending book.</w:t>
+        <w:t xml:space="preserve">Profitability was solid. On a six-month (non-annualised) basis the return on assets was approximately 1.1%, consistent with the 2025 1H figure in Section 2.4; annualised (six-month result × 2), this equates to a return on assets of approximately 2.3% and a return on equity of approximately 15.7%, consistent with the annualised peer comparison in Section 2.5. The annualised returns reflect the strong first-half run-rate and are presented for full-year-equivalent comparability.</w:t>
       </w:r>
     </w:p>
     <w:p>

</xml_diff>

<commit_message>
Update cost of funds to 1.87% and recalculate Section 8.1 economics
3-year CNH cost of funds 1.46% -> 1.87% (187 bps); net interest spread
3.80% - 1.87% = 1.93% (193 bps); on CNH 300m, NII ~CNH 5.8m/yr; over the
3-year tenor ~CNH 19.2m total (~CNH 6.4m p.a.), ~USD 2.7m aggregate
(~USD 0.9m p.a.).
</commit_message>
<xml_diff>
--- a/NBU_Credit_Limit_Report_Jun_26_Ver_2.docx
+++ b/NBU_Credit_Limit_Report_Jun_26_Ver_2.docx
@@ -19420,7 +19420,7 @@
         <w:rPr>
           <w:color w:val="1A1A1A"/>
         </w:rPr>
-        <w:t>The revenue and cost analysis below reflects the term-sheet pricing - a fixed interest rate of 3.8% per annum and a 0.6% flat upfront fee - and ICBC (DIFC Branch)'s cost of funds for three-year CNH of 1.46% per annum. Figures are indicative and remain subject to confirmation by Treasury / FID.</w:t>
+        <w:t>The revenue and cost analysis below reflects the term-sheet pricing - a fixed interest rate of 3.8% per annum and a 0.6% flat upfront fee - and ICBC (DIFC Branch)'s cost of funds for three-year CNH of 1.87% per annum. Figures are indicative and remain subject to confirmation by Treasury / FID.</w:t>
       </w:r>
     </w:p>
     <w:p>
@@ -19442,7 +19442,7 @@
         <w:rPr>
           <w:color w:val="1A1A1A"/>
         </w:rPr>
-        <w:t>Cost of funds (3-year CNH): 1.46% per annum (146 bps).</w:t>
+        <w:t>Cost of funds (3-year CNH): 1.87% per annum (187 bps).</w:t>
       </w:r>
     </w:p>
     <w:p>
@@ -19453,7 +19453,7 @@
         <w:rPr>
           <w:color w:val="1A1A1A"/>
         </w:rPr>
-        <w:t>Net interest spread: 3.80% - 1.46% = 2.34% per annum (234 bps).</w:t>
+        <w:t>Net interest spread: 3.80% - 1.87% = 1.93% per annum (193 bps).</w:t>
       </w:r>
     </w:p>
     <w:p>
@@ -19486,7 +19486,7 @@
         <w:rPr>
           <w:color w:val="1A1A1A"/>
         </w:rPr>
-        <w:t>Net income to ICBC (DIFC Branch): approximately 2.34% per annum (net interest spread), plus the 0.60% upfront fee.</w:t>
+        <w:t>Net income to ICBC (DIFC Branch): approximately 1.93% per annum (net interest spread), plus the 0.60% upfront fee.</w:t>
       </w:r>
     </w:p>
     <w:p>
@@ -19497,7 +19497,7 @@
         <w:rPr>
           <w:color w:val="1A1A1A"/>
         </w:rPr>
-        <w:t>Applied to the CNH 300 million commitment: net interest income of approximately CNH 7.0 million per annum (CNH 300 million x 2.34%), plus an upfront fee of approximately CNH 1.8 million (CNH 300 million x 0.60%). Over the three-year tenor this totals approximately CNH 22.9 million (about CNH 7.6 million per annum equivalent), or approximately USD 3.2 million in aggregate (around USD 1.0 million per annum) at an indicative rate of CNH 7.2 per USD. Final figures depend on the confirmed committed amount, drawn balances and cost of funds.</w:t>
+        <w:t>Applied to the CNH 300 million commitment: net interest income of approximately CNH 5.8 million per annum (CNH 300 million x 1.93%), plus an upfront fee of approximately CNH 1.8 million (CNH 300 million x 0.60%). Over the three-year tenor this totals approximately CNH 19.2 million (about CNH 6.4 million per annum equivalent), or approximately USD 2.7 million in aggregate (around USD 0.9 million per annum) at an indicative rate of CNH 7.2 per USD. Final figures depend on the confirmed committed amount, drawn balances and cost of funds.</w:t>
       </w:r>
     </w:p>
     <w:p>

</xml_diff>

<commit_message>
Replace inflated NBU LCR (~520%) with stressed estimate ~195%
Recompute NBU LCR from the 1H2025 (and FY2024) IFRS balance sheet using
standard Basel III stress assumptions (HQLA over stressed 30-day net
outflows): ~198% at 1H2025 and ~216% at FY2024, shown as ~195% in the
peer table, consistent with the CBU published banking-sector LCR of 194%
at end-2024. Footnote documents the method and the no-disclosure caveat.
The prior ~520% was a maturity-gap proxy that overstated the ratio.
</commit_message>
<xml_diff>
--- a/NBU_Credit_Limit_Report_Jun_26_Ver_2.docx
+++ b/NBU_Credit_Limit_Report_Jun_26_Ver_2.docx
@@ -13214,7 +13214,7 @@
                 <w:sz w:val="18"/>
                 <w:szCs w:val="18"/>
               </w:rPr>
-              <w:t>~520%</w:t>
+              <w:t>~195%</w:t>
             </w:r>
           </w:p>
         </w:tc>
@@ -15050,7 +15050,7 @@
           <w:sz w:val="16"/>
           <w:szCs w:val="16"/>
         </w:rPr>
-        <w:t>All five banks are shown on a 2025 1H basis as at 30 June 2025; monetary KPIs in USD million, ratios in per cent. Only ROE and ROA are annualised (six-month result × 2); net profit and net interest income are six-month (1H 2025) figures and NIM is each bank’s published period margin. FX uniform at USD/UZS = 12,150 and USD/KZT = 519.73 (period-end, 30 June 2025). ¹ NPL ratios for the Uzbek banks are shown on the Central Bank of Uzbekistan (CBU) regulatory basis from the CBU’s monthly NPL statistics for June 2025 — NBU approximately 2.9% and SQB approximately 3.7%, against a banking-sector average of approximately 3.8% — on which consistent basis NBU’s asset quality compares favourably with SQB and the sector. Agrobank (approximately 5.8%) and the Kazakh banks (Halyk 6.6%, Kaspi 5.7%) are shown on the IFRS Stage 3 / non-performing basis per their own disclosures, as the CBU does not separately publish their regulatory NPL. NBU’s IFRS Stage 3 ratio was 4.2% at 30 June 2025; the difference from the 2.9% regulatory figure reflects the more conservative IFRS staging definition, and the 5.6% figure cited elsewhere is NBU’s provision-to-gross-loans coverage ratio (not an NPL ratio). ² Agrobank reported-period net interest income is not reliably disclosed and is marked n.a. ³ Kaspi.kz reports as a diversified payments/marketplace/fintech group and does not disclose NIM, cost-to-income, ROE, ROA, regulatory capital or NPL coverage on a comparable banking basis (marked n.a.); its 1H 2025 net profit of about USD 987 million (KZT 513 billion) is the consolidated figure including the Hepsiburada/Türkiye operations. Figures marked “~” for Halyk and Kaspi (net interest income, ROA, capital, LDR, and the balance-sheet scale lines) are FID estimates derived from each bank’s 1H 2025 results releases, disclosed growth rates and period-end positions, pending the full interim IFRS statements; SQB and Agrobank figures, and the NBU LCR/NSFR marked *, are FID estimates as in Section 2.4. Sources: Halyk Bank 1H 2025 results (19 August 2025) and Kaspi.kz 2Q &amp; 1H 2025 results (4 August 2025); Central Bank of Uzbekistan (monthly NPL statistics, June 2025); and Moody’s, Fitch and S&amp;P rating publications. Halyk: Moody’s Baa1, Fitch BBB-, S&amp;P BBB- (all Stable). Kaspi.kz: Moody’s Baa3, Fitch BBB- (Stable); not rated by S&amp;P.</w:t>
+        <w:t>All five banks are shown on a 2025 1H basis as at 30 June 2025; monetary KPIs in USD million, ratios in per cent. Only ROE and ROA are annualised (six-month result × 2); net profit and net interest income are six-month (1H 2025) figures and NIM is each bank’s published period margin. FX uniform at USD/UZS = 12,150 and USD/KZT = 519.73 (period-end, 30 June 2025). ¹ NPL ratios for the Uzbek banks are shown on the Central Bank of Uzbekistan (CBU) regulatory basis from the CBU’s monthly NPL statistics for June 2025 — NBU approximately 2.9% and SQB approximately 3.7%, against a banking-sector average of approximately 3.8% — on which consistent basis NBU’s asset quality compares favourably with SQB and the sector. Agrobank (approximately 5.8%) and the Kazakh banks (Halyk 6.6%, Kaspi 5.7%) are shown on the IFRS Stage 3 / non-performing basis per their own disclosures, as the CBU does not separately publish their regulatory NPL. NBU’s IFRS Stage 3 ratio was 4.2% at 30 June 2025; the difference from the 2.9% regulatory figure reflects the more conservative IFRS staging definition, and the 5.6% figure cited elsewhere is NBU’s provision-to-gross-loans coverage ratio (not an NPL ratio). ² Agrobank reported-period net interest income is not reliably disclosed and is marked n.a. ³ Kaspi.kz reports as a diversified payments/marketplace/fintech group and does not disclose NIM, cost-to-income, ROE, ROA, regulatory capital or NPL coverage on a comparable banking basis (marked n.a.); its 1H 2025 net profit of about USD 987 million (KZT 513 billion) is the consolidated figure including the Hepsiburada/Türkiye operations. Figures marked “~” for Halyk and Kaspi (net interest income, ROA, capital, LDR, and the balance-sheet scale lines) are FID estimates derived from each bank’s 1H 2025 results releases, disclosed growth rates and period-end positions, pending the full interim IFRS statements; SQB and Agrobank figures are FID estimates as in Section 2.4. NBU’s LCR and NSFR (marked *) are FID estimates: the LCR (~195%) is computed from NBU’s 1H 2025 IFRS balance sheet on standard Basel III stress assumptions (high-quality liquid assets — cash, CBU balances and government securities — over stressed 30-day net outflows; the equivalent FY2024 estimate is ~215%) and is consistent with the Central Bank of Uzbekistan’s published banking-sector LCR of 194% at end-2024, with NSFR ~115% matching the sector. NBU does not separately disclose its regulatory LCR/NSFR, which should be confirmed against its CBU prudential returns. Sources: Halyk Bank 1H 2025 results (19 August 2025) and Kaspi.kz 2Q &amp; 1H 2025 results (4 August 2025); Central Bank of Uzbekistan (monthly NPL statistics, June 2025); and Moody’s, Fitch and S&amp;P rating publications. Halyk: Moody’s Baa1, Fitch BBB-, S&amp;P BBB- (all Stable). Kaspi.kz: Moody’s Baa3, Fitch BBB- (Stable); not rated by S&amp;P.</w:t>
       </w:r>
     </w:p>
     <w:p>

</xml_diff>

<commit_message>
Add asset-growth-vs-profit analysis to Section 2.2 Asset Analysis
Append two paragraphs explaining why NBU's balance sheet grew faster than
earnings (declining ROA ~1.4%->1.1%): growth concentrated in low-yielding
liquid assets vs +1.7% net loans, NIM squeeze (interest expense +17.5% vs
income +12.9%), higher opex/provisioning/tax, and the structural low-margin
state-directed lending model.
</commit_message>
<xml_diff>
--- a/NBU_Credit_Limit_Report_Jun_26_Ver_2.docx
+++ b/NBU_Credit_Limit_Report_Jun_26_Ver_2.docx
@@ -8297,6 +8297,28 @@
           <w:color w:val="1A1A1A"/>
         </w:rPr>
         <w:t xml:space="preserve">On asset quality, NBU’s regulatory NPL ratio of approximately 2.8% (CBU, NBU-specific) sits below the banking-sector average of 4.1% (December 2025), consistent with the Bank’s position as the state-owned flagship institution. On an IFRS basis, Stage 3 (credit-impaired) loans were approximately 4.2% of gross loans at 30 June 2025, while the loan-loss provision coverage ratio (total provisions to gross loans) was approximately 5.6% on a statutory basis and is not an NPL ratio; the IMF has noted that IFRS Stage 3 ratios in Uzbekistan typically run at roughly twice the regulatory NPL ratio. NBU’s capitalisation is solid: total equity was UZS 21.1 trillion at 30 June 2025, equivalent to a capital-to-assets ratio of approximately 14.5%, and Fitch has estimated the Bank’s Fitch Core Capital ratio above 20% for 2024-2025. NBU’s estimated bank-level regulatory CAR (~18.2%) and Tier 1 ratio (~16.9%) at 30 June 2025 are set out in Section 2.4.</w:t>
+      </w:r>
+    </w:p>
+    <w:p>
+      <w:pPr>
+        <w:spacing w:before="60" w:after="80"/>
+      </w:pPr>
+      <w:r>
+        <w:rPr>
+          <w:color w:val="1A1A1A"/>
+        </w:rPr>
+        <w:t xml:space="preserve">A notable feature of the period is that asset growth outpaced earnings growth, so profitability per unit of assets declined: net profit rose only 9.1% year on year (to UZS 1,653.1 billion in 1H 2025) while the balance sheet expanded more quickly, taking the return on assets from approximately 1.4% in 2023 and 1.3% in 2024 to approximately 1.1% on a six-month basis in 1H 2025. This largely reflects the composition of the growth: the expansion was concentrated in low-yielding liquid assets — cash and cash equivalents rose 51.1% while net loans grew only 1.7% — so the asset base grew without a commensurate rise in interest income, and the net interest margin was squeezed as interest expense increased 17.5% year on year against a 12.9% rise in interest income amid rapid, higher-cost deposit growth, holding net interest income growth to 8.4%.</w:t>
+      </w:r>
+    </w:p>
+    <w:p>
+      <w:pPr>
+        <w:spacing w:before="60" w:after="80"/>
+      </w:pPr>
+      <w:r>
+        <w:rPr>
+          <w:color w:val="1A1A1A"/>
+        </w:rPr>
+        <w:t xml:space="preserve">Higher operating expenses (+15.7%), provisioning (+11.3%) and a 22.1% increase in income tax then absorbed much of the pre-tax gain (profit before tax rose 11.9%). The pattern is also structural: as the state flagship, NBU carries a large book of lower-margin, state-directed project finance to government-related entities, which keeps its return on assets below the ~2.2% sector average and makes balance-sheet growth inherently volume-driven and dilutive to returns; part of the 1H 2025 profit was, moreover, carried by more volatile foreign-exchange gains (+46.3%) and fee income (+24.7%) rather than core lending spread income.</w:t>
       </w:r>
     </w:p>
     <w:p>

</xml_diff>